<commit_message>
Rebrand domain miras.global to mirasprotocol.com
Swap all domain and brand references from the lost miras.global to
mirasprotocol.com / Miras Protocol across the web app, blog content,
TOS, crypto-will wizard docs, SEO metadata (metadataBase, robots,
sitemap), and the whitepaper PDF/DOCX.

- Centralize the API host in a single API_BASE_URL export in
  web/lib/config.ts (previously duplicated in 4 call sites)
- Point NEXT_PUBLIC_API_URL default to https://api.mirasprotocol.com
- Update whitepaper PDF + DOCX (header, cover, body links)
- Resize icon.svg wordmark to fit the longer domain
- Add *.tsbuildinfo to .gitignore
- Keep pressreleases.online/org/miras.global footer link for now (new
  slug 404s; TODO to repoint once the org is re-registered)
</commit_message>
<xml_diff>
--- a/web/public/whitepapers/your-crypto-shouldnt-die-with-you.docx
+++ b/web/public/whitepapers/your-crypto-shouldnt-die-with-you.docx
@@ -64,7 +64,7 @@
           <w:rPr>
             <w:rStyle w:val="Hyperlink"/>
           </w:rPr>
-          <w:t xml:space="preserve">miras.global</w:t>
+          <w:t xml:space="preserve">mirasprotocol.com</w:t>
         </w:r>
       </w:hyperlink>
     </w:p>
@@ -2744,7 +2744,7 @@
           <w:rPr>
             <w:rStyle w:val="Hyperlink"/>
           </w:rPr>
-          <w:t xml:space="preserve">miras.global</w:t>
+          <w:t xml:space="preserve">mirasprotocol.com</w:t>
         </w:r>
       </w:hyperlink>
       <w:r>
@@ -3167,7 +3167,7 @@
                   <w:sz w:val="24"/>
                   <w:szCs w:val="24"/>
                 </w:rPr>
-                <w:t xml:space="preserve">miras.global</w:t>
+                <w:t xml:space="preserve">mirasprotocol.com</w:t>
               </w:r>
             </w:hyperlink>
           </w:p>
@@ -3325,7 +3325,7 @@
         <w:sz w:val="18"/>
         <w:szCs w:val="18"/>
       </w:rPr>
-      <w:t xml:space="preserve">miras.global</w:t>
+      <w:t xml:space="preserve">mirasprotocol.com</w:t>
     </w:r>
     <w:r>
       <w:rPr>

</xml_diff>